<commit_message>
UPDATE MOSHIA PAYMENT - 05102026
</commit_message>
<xml_diff>
--- a/docs/planning/MOSHIACHEKLIST.docx
+++ b/docs/planning/MOSHIACHEKLIST.docx
@@ -26,7 +26,7 @@
           <w:rFonts w:ascii="Calibri" w:hAnsi="Calibri"/>
           <w:sz w:val="21"/>
         </w:rPr>
-        <w:t xml:space="preserve">8 item tersedia; C01/D02 sebagian selesai. Centang berarti implementasi/artefak tersedia, bukan sertifikasi siap produksi. Ringkasan: MOSHIAUPDATE-05102026.md.</w:t>
+        <w:t xml:space="preserve">9 item tersedia; 9 sebagian. C02/C03 manual development tersedia; Midtrans dan Wedding lengkap menyusul. Rincian: WEDDING_LIFECYCLE.md.</w:t>
       </w:r>
     </w:p>
     <w:p>
@@ -65,7 +65,7 @@
           <w:rFonts w:ascii="Calibri" w:hAnsi="Calibri"/>
           <w:sz w:val="21"/>
         </w:rPr>
-        <w:t xml:space="preserve">Fokus: daftar/login → pilih paket → pembayaran → akses aktif → dashboard Wedding → customize → publish.</w:t>
+        <w:t xml:space="preserve">Fokus: verifikasi akun → workspace → paket → Payment accepted → editor/preview → Publish → masa aktif. Rekening dummy development; Midtrans menyusul.</w:t>
       </w:r>
     </w:p>
     <w:p>
@@ -92,19 +92,19 @@
           <w:color w:val="B51C2B"/>
           <w:sz w:val="26"/>
         </w:rPr>
-        <w:t xml:space="preserve">Progres terbaru — draft Wedding</w:t>
-      </w:r>
-    </w:p>
-    <w:p>
-      <w:pPr>
-        <w:spacing w:after="100"/>
-      </w:pPr>
-      <w:r>
-        <w:rPr>
-          <w:rFonts w:ascii="Calibri" w:hAnsi="Calibri"/>
-          <w:sz w:val="21"/>
-        </w:rPr>
-        <w:t xml:space="preserve">Pilihan Gold/Emerald/Diamond tersedia pada form draft admin. C01 dan D02 sebagian selesai; subscription, pembayaran, dan penegakan aturan Wedding belum tersedia. [Detail keputusan, implementasi dan pengujian](WEDDING_PACKAGES.md).</w:t>
+        <w:t xml:space="preserve">Progres terbaru — pembayaran manual dan Wedding dasar</w:t>
+      </w:r>
+    </w:p>
+    <w:p>
+      <w:pPr>
+        <w:spacing w:after="100"/>
+      </w:pPr>
+      <w:r>
+        <w:rPr>
+          <w:rFonts w:ascii="Calibri" w:hAnsi="Calibri"/>
+          <w:sz w:val="21"/>
+        </w:rPr>
+        <w:t xml:space="preserve">Pembayaran manual development, editor teks, preview privat, Publish, expiry dan reaktivasi tersedia. C02/C03 tetap sebagian. Lihat WEDDING_LIFECYCLE.md untuk cara mencoba dan batas implementasi.</w:t>
       </w:r>
     </w:p>
     <w:p>
@@ -215,7 +215,7 @@
           <w:rFonts w:ascii="Calibri" w:hAnsi="Calibri"/>
           <w:sz w:val="21"/>
         </w:rPr>
-        <w:t xml:space="preserve">Status saat ini: 8 item tersedia (S01–S08) sudah dicentang; 46 item lainnya belum dicentang. Ini jumlah item checklist, bukan persentase penyelesaian project. Centang fitur menunjukkan implementasi tersedia, bukan jaminan lulus UAT atau siap produksi. S08 adalah workbook/artefak pendukung. Hasil terbaru: 132 tes/1.052 assertions lulus; lihat catatan aturan Wedding di bawah.</w:t>
+        <w:t xml:space="preserve">Status saat ini: 9 item tersedia (S01-S08 dan W03) dicentang; 45 belum dicentang. Rincian: 9 sebagian, 15 belum, 6 menunggu keputusan, 10 perlu verifikasi, 1 ditunda, 4 opsional. Ini jumlah item, bukan persentase project. Hasil terbaru: 168 tes / 1.311 assertions; build 800 modul. UAT belum dilakukan.</w:t>
       </w:r>
     </w:p>
     <w:p>
@@ -239,7 +239,7 @@
           <w:rFonts w:ascii="Calibri" w:hAnsi="Calibri"/>
           <w:sz w:val="21"/>
         </w:rPr>
-        <w:t xml:space="preserve">Mulai: V01–V04 → keputusan paket D02 → C01 dan ketergantungannya → Wedding. D01 hanya menentukan aturan pemilik workspace untuk tahap awal; kolaborasi anggota tidak menghambat fokus ini.</w:t>
+        <w:t xml:space="preserve">Mulai: UAT alur manual → scope Wedding D04/storage/kuota → template/media → Midtrans sandbox dan domain sesuai fase. Kolaborasi anggota tetap ditunda.</w:t>
       </w:r>
     </w:p>
     <w:p>
@@ -266,19 +266,19 @@
           <w:rFonts w:ascii="Calibri" w:hAnsi="Calibri"/>
           <w:sz w:val="21"/>
         </w:rPr>
-        <w:t xml:space="preserve">- Tes otomatis: 128 passed, 990 assertions, memakai SQLite in-memory; durasi 23,07 detik.</w:t>
-      </w:r>
-    </w:p>
-    <w:p>
-      <w:pPr>
-        <w:spacing w:after="100"/>
-      </w:pPr>
-      <w:r>
-        <w:rPr>
-          <w:rFonts w:ascii="Calibri" w:hAnsi="Calibri"/>
-          <w:sz w:val="21"/>
-        </w:rPr>
-        <w:t xml:space="preserve">- Database lokal: seluruh migration hingga 2026_10_02_000007 berstatus Ran; tidak menjalankan migration atau reset database.</w:t>
+        <w:t xml:space="preserve">- Tes otomatis: 168 passed, 1.311 assertions, SQLite in-memory. Mencakup pembayaran manual, batas expiry, reaktivasi, isolasi tenant dan rollback.</w:t>
+      </w:r>
+    </w:p>
+    <w:p>
+      <w:pPr>
+        <w:spacing w:after="100"/>
+      </w:pPr>
+      <w:r>
+        <w:rPr>
+          <w:rFonts w:ascii="Calibri" w:hAnsi="Calibri"/>
+          <w:sz w:val="21"/>
+        </w:rPr>
+        <w:t xml:space="preserve">- Database lokal: migration 2026_10_05_000009 berhasil pada MySQL lokal. Tidak melakukan reset/restore database.</w:t>
       </w:r>
     </w:p>
     <w:p>
@@ -302,31 +302,31 @@
           <w:rFonts w:ascii="Calibri" w:hAnsi="Calibri"/>
           <w:sz w:val="21"/>
         </w:rPr>
-        <w:t xml:space="preserve">- Git: docs/planning masih untracked pada pemeriksaan awal. Tidak melakukan commit/push.</w:t>
-      </w:r>
-    </w:p>
-    <w:p>
-      <w:pPr>
-        <w:spacing w:after="100"/>
-      </w:pPr>
-      <w:r>
-        <w:rPr>
-          <w:rFonts w:ascii="Calibri" w:hAnsi="Calibri"/>
-          <w:sz w:val="21"/>
-        </w:rPr>
-        <w:t xml:space="preserve">- V01–V03 tetap belum dicentang penuh: backup, kelengkapan perpindahan device, UAT browser/mobile dan email nyata belum diverifikasi. V04 belum dilakukan; build/dev tidak dijalankan.</w:t>
-      </w:r>
-    </w:p>
-    <w:p>
-      <w:pPr>
-        <w:spacing w:after="100"/>
-      </w:pPr>
-      <w:r>
-        <w:rPr>
-          <w:rFonts w:ascii="Calibri" w:hAnsi="Calibri"/>
-          <w:sz w:val="21"/>
-        </w:rPr>
-        <w:t xml:space="preserve">- Berikutnya: D02 (aturan paket). Tetap gunakan draft sampai harga, masa aktif, trial dan kuota ditentukan pengguna. Kolaborasi anggota tetap ditunda.</w:t>
+        <w:t xml:space="preserve">- Git: perubahan source/dokumen belum di-commit atau push.</w:t>
+      </w:r>
+    </w:p>
+    <w:p>
+      <w:pPr>
+        <w:spacing w:after="100"/>
+      </w:pPr>
+      <w:r>
+        <w:rPr>
+          <w:rFonts w:ascii="Calibri" w:hAnsi="Calibri"/>
+          <w:sz w:val="21"/>
+        </w:rPr>
+        <w:t xml:space="preserve">- V01–V04 tetap perlu verifikasi penuh: build setelah approval berhasil (800 modul), tetapi UAT browser/mobile, email nyata tahap ini dan restore backup belum dilakukan.</w:t>
+      </w:r>
+    </w:p>
+    <w:p>
+      <w:pPr>
+        <w:spacing w:after="100"/>
+      </w:pPr>
+      <w:r>
+        <w:rPr>
+          <w:rFonts w:ascii="Calibri" w:hAnsi="Calibri"/>
+          <w:sz w:val="21"/>
+        </w:rPr>
+        <w:t xml:space="preserve">- Berikutnya: UAT alur manual lalu scope template/media Wedding dan Midtrans sandbox. Harga tetap snapshot server; trial/kuota/pajak/refund/grace belum ditetapkan.</w:t>
       </w:r>
     </w:p>
     <w:p>
@@ -872,7 +872,7 @@
           <w:rFonts w:ascii="Calibri" w:hAnsi="Calibri"/>
           <w:sz w:val="21"/>
         </w:rPr>
-        <w:t xml:space="preserve">Penerimaan / tindakan: Hanya produk/nama/deskripsi yang diedit; status draft; input harga/trial/kuota ditolak sampai desain komersial disetujui.</w:t>
+        <w:t xml:space="preserve">Penerimaan / tindakan: Nama/deskripsi dan preset Wedding dapat diedit; snapshot aturan dari server, input harga langsung ditolak. Draft tidak aktif otomatis; checkout development memakai preset terpisah.</w:t>
       </w:r>
     </w:p>
     <w:p>
@@ -1052,7 +1052,7 @@
           <w:rFonts w:ascii="Calibri" w:hAnsi="Calibri"/>
           <w:sz w:val="21"/>
         </w:rPr>
-        <w:t xml:space="preserve">Penerimaan / tindakan: Empat template produk dengan harga kosong tersedia; file dapat dibuka; hasil isian owner disimpan. Belum ada import otomatis.</w:t>
+        <w:t xml:space="preserve">Penerimaan / tindakan: Workbook empat produk tersedia; isian Wedding pada docs/planning/Paket Product Moshia.xlsx. Produk lain TBC; belum ada import otomatis.</w:t>
       </w:r>
     </w:p>
     <w:p>
@@ -1223,19 +1223,19 @@
           <w:rFonts w:ascii="Calibri" w:hAnsi="Calibri"/>
           <w:sz w:val="21"/>
         </w:rPr>
-        <w:t xml:space="preserve">☐ D03 — Provider sesuai fase · TUNGGU KEPUTUSAN</w:t>
-      </w:r>
-    </w:p>
-    <w:p>
-      <w:pPr>
-        <w:spacing w:after="100"/>
-      </w:pPr>
-      <w:r>
-        <w:rPr>
-          <w:rFonts w:ascii="Calibri" w:hAnsi="Calibri"/>
-          <w:sz w:val="21"/>
-        </w:rPr>
-        <w:t xml:space="preserve">Status: TUNGGU KEPUTUSAN | PRD: D03 | Bergantung pada: Sesuai fase</w:t>
+        <w:t xml:space="preserve">☐ D03 — Provider sesuai fase · SEBAGIAN</w:t>
+      </w:r>
+    </w:p>
+    <w:p>
+      <w:pPr>
+        <w:spacing w:after="100"/>
+      </w:pPr>
+      <w:r>
+        <w:rPr>
+          <w:rFonts w:ascii="Calibri" w:hAnsi="Calibri"/>
+          <w:sz w:val="21"/>
+        </w:rPr>
+        <w:t xml:space="preserve">Status: SEBAGIAN | PRD: D03 | Bergantung pada: Sesuai fase</w:t>
       </w:r>
     </w:p>
     <w:p>
@@ -1259,7 +1259,7 @@
           <w:rFonts w:ascii="Calibri" w:hAnsi="Calibri"/>
           <w:sz w:val="21"/>
         </w:rPr>
-        <w:t xml:space="preserve">Bukti awal / lokasi: Keputusan tertulis product owner; kolom PIC wajib diisi, jangan menetapkan harga/provider secara otomatis.</w:t>
+        <w:t xml:space="preserve">Bukti awal / lokasi: Midtrans dipilih sebagai rencana gateway; development manual. Keputusan storage/DNS dan konfigurasi gateway masih terbuka. Detail: WEDDING_LIFECYCLE.md.</w:t>
       </w:r>
     </w:p>
     <w:p>
@@ -1658,19 +1658,19 @@
           <w:rFonts w:ascii="Calibri" w:hAnsi="Calibri"/>
           <w:sz w:val="21"/>
         </w:rPr>
-        <w:t xml:space="preserve">☐ C02 — Lifecycle subscription · BELUM</w:t>
-      </w:r>
-    </w:p>
-    <w:p>
-      <w:pPr>
-        <w:spacing w:after="100"/>
-      </w:pPr>
-      <w:r>
-        <w:rPr>
-          <w:rFonts w:ascii="Calibri" w:hAnsi="Calibri"/>
-          <w:sz w:val="21"/>
-        </w:rPr>
-        <w:t xml:space="preserve">Status: BELUM | PRD: CORE 03/04 | Bergantung pada: C01; D02</w:t>
+        <w:t xml:space="preserve">☐ C02 — Lifecycle subscription · SEBAGIAN</w:t>
+      </w:r>
+    </w:p>
+    <w:p>
+      <w:pPr>
+        <w:spacing w:after="100"/>
+      </w:pPr>
+      <w:r>
+        <w:rPr>
+          <w:rFonts w:ascii="Calibri" w:hAnsi="Calibri"/>
+          <w:sz w:val="21"/>
+        </w:rPr>
+        <w:t xml:space="preserve">Status: SEBAGIAN | PRD: CORE 03/04 | Bergantung pada: C01; D02</w:t>
       </w:r>
     </w:p>
     <w:p>
@@ -1694,6 +1694,126 @@
           <w:rFonts w:ascii="Calibri" w:hAnsi="Calibri"/>
           <w:sz w:val="21"/>
         </w:rPr>
+        <w:t xml:space="preserve">Bukti awal / lokasi: WeddingPurchase + ManualWeddingBilling; periode tersimpan, expiry dan reaktivasi sejak Publish; tests/Feature/Core/ManualWeddingBillingTest.php. Refund/operasi dan concurrency MySQL belum selesai. Detail: WEDDING_LIFECYCLE.md.</w:t>
+      </w:r>
+    </w:p>
+    <w:p>
+      <w:pPr>
+        <w:spacing w:after="100"/>
+      </w:pPr>
+      <w:r>
+        <w:rPr>
+          <w:rFonts w:ascii="Calibri" w:hAnsi="Calibri"/>
+          <w:sz w:val="21"/>
+        </w:rPr>
+        <w:t xml:space="preserve">PIC: __________ · Tanggal: __________ · Bukti/hasil: __________</w:t>
+      </w:r>
+    </w:p>
+    <w:p>
+      <w:pPr>
+        <w:spacing w:after="100"/>
+      </w:pPr>
+      <w:r>
+        <w:rPr>
+          <w:rFonts w:ascii="Calibri" w:hAnsi="Calibri"/>
+          <w:sz w:val="21"/>
+        </w:rPr>
+        <w:t xml:space="preserve">☐ C03 — Checkout, payment dan invoice · SEBAGIAN</w:t>
+      </w:r>
+    </w:p>
+    <w:p>
+      <w:pPr>
+        <w:spacing w:after="100"/>
+      </w:pPr>
+      <w:r>
+        <w:rPr>
+          <w:rFonts w:ascii="Calibri" w:hAnsi="Calibri"/>
+          <w:sz w:val="21"/>
+        </w:rPr>
+        <w:t xml:space="preserve">Status: SEBAGIAN | PRD: CORE 03 | Bergantung pada: C01–C02; D03</w:t>
+      </w:r>
+    </w:p>
+    <w:p>
+      <w:pPr>
+        <w:spacing w:after="100"/>
+      </w:pPr>
+      <w:r>
+        <w:rPr>
+          <w:rFonts w:ascii="Calibri" w:hAnsi="Calibri"/>
+          <w:sz w:val="21"/>
+        </w:rPr>
+        <w:t xml:space="preserve">Penerimaan / tindakan: Adapter gateway, transaksi dan invoice sesuai kebijakan; nilai dihitung server; status pending/failed tidak memberikan akses; tampilkan billing pelanggan.</w:t>
+      </w:r>
+    </w:p>
+    <w:p>
+      <w:pPr>
+        <w:spacing w:after="100"/>
+      </w:pPr>
+      <w:r>
+        <w:rPr>
+          <w:rFonts w:ascii="Calibri" w:hAnsi="Calibri"/>
+          <w:sz w:val="21"/>
+        </w:rPr>
+        <w:t xml:space="preserve">Bukti awal / lokasi: Order/checkout manual development BCA 12345678 MOSHIA CORPORATE; Payment accepted oleh superadmin. Midtrans/invoice belum diimplementasikan. Detail: WEDDING_LIFECYCLE.md.</w:t>
+      </w:r>
+    </w:p>
+    <w:p>
+      <w:pPr>
+        <w:spacing w:after="100"/>
+      </w:pPr>
+      <w:r>
+        <w:rPr>
+          <w:rFonts w:ascii="Calibri" w:hAnsi="Calibri"/>
+          <w:sz w:val="21"/>
+        </w:rPr>
+        <w:t xml:space="preserve">PIC: __________ · Tanggal: __________ · Bukti/hasil: __________</w:t>
+      </w:r>
+    </w:p>
+    <w:p>
+      <w:pPr>
+        <w:spacing w:after="100"/>
+      </w:pPr>
+      <w:r>
+        <w:rPr>
+          <w:rFonts w:ascii="Calibri" w:hAnsi="Calibri"/>
+          <w:sz w:val="21"/>
+        </w:rPr>
+        <w:t xml:space="preserve">☐ C04 — Webhook terverifikasi dan idempoten · BELUM</w:t>
+      </w:r>
+    </w:p>
+    <w:p>
+      <w:pPr>
+        <w:spacing w:after="100"/>
+      </w:pPr>
+      <w:r>
+        <w:rPr>
+          <w:rFonts w:ascii="Calibri" w:hAnsi="Calibri"/>
+          <w:sz w:val="21"/>
+        </w:rPr>
+        <w:t xml:space="preserve">Status: BELUM | PRD: CORE 03 | Bergantung pada: C03</w:t>
+      </w:r>
+    </w:p>
+    <w:p>
+      <w:pPr>
+        <w:spacing w:after="100"/>
+      </w:pPr>
+      <w:r>
+        <w:rPr>
+          <w:rFonts w:ascii="Calibri" w:hAnsi="Calibri"/>
+          <w:sz w:val="21"/>
+        </w:rPr>
+        <w:t xml:space="preserve">Penerimaan / tindakan: Uji valid/invalid, duplikat, event terlambat/out-of-order, concurrency dan timeout pada database target; satu payment tidak menggandakan akses/invoice.</w:t>
+      </w:r>
+    </w:p>
+    <w:p>
+      <w:pPr>
+        <w:spacing w:after="100"/>
+      </w:pPr>
+      <w:r>
+        <w:rPr>
+          <w:rFonts w:ascii="Calibri" w:hAnsi="Calibri"/>
+          <w:sz w:val="21"/>
+        </w:rPr>
         <w:t xml:space="preserve">Bukti awal / lokasi: Tambahkan tautan implementasi, migration dan hasil tes saat dikerjakan.</w:t>
       </w:r>
     </w:p>
@@ -1718,31 +1838,31 @@
           <w:rFonts w:ascii="Calibri" w:hAnsi="Calibri"/>
           <w:sz w:val="21"/>
         </w:rPr>
-        <w:t xml:space="preserve">☐ C03 — Checkout, payment dan invoice · BELUM</w:t>
-      </w:r>
-    </w:p>
-    <w:p>
-      <w:pPr>
-        <w:spacing w:after="100"/>
-      </w:pPr>
-      <w:r>
-        <w:rPr>
-          <w:rFonts w:ascii="Calibri" w:hAnsi="Calibri"/>
-          <w:sz w:val="21"/>
-        </w:rPr>
-        <w:t xml:space="preserve">Status: BELUM | PRD: CORE 03 | Bergantung pada: C01–C02; D03</w:t>
-      </w:r>
-    </w:p>
-    <w:p>
-      <w:pPr>
-        <w:spacing w:after="100"/>
-      </w:pPr>
-      <w:r>
-        <w:rPr>
-          <w:rFonts w:ascii="Calibri" w:hAnsi="Calibri"/>
-          <w:sz w:val="21"/>
-        </w:rPr>
-        <w:t xml:space="preserve">Penerimaan / tindakan: Adapter gateway, transaksi dan invoice sesuai kebijakan; nilai dihitung server; status pending/failed tidak memberikan akses; tampilkan billing pelanggan.</w:t>
+        <w:t xml:space="preserve">☐ C05 — Trial provisioning dan quota atomik · BELUM</w:t>
+      </w:r>
+    </w:p>
+    <w:p>
+      <w:pPr>
+        <w:spacing w:after="100"/>
+      </w:pPr>
+      <w:r>
+        <w:rPr>
+          <w:rFonts w:ascii="Calibri" w:hAnsi="Calibri"/>
+          <w:sz w:val="21"/>
+        </w:rPr>
+        <w:t xml:space="preserve">Status: BELUM | PRD: CORE 04 | Bergantung pada: D02; C01–C02</w:t>
+      </w:r>
+    </w:p>
+    <w:p>
+      <w:pPr>
+        <w:spacing w:after="100"/>
+      </w:pPr>
+      <w:r>
+        <w:rPr>
+          <w:rFonts w:ascii="Calibri" w:hAnsi="Calibri"/>
+          <w:sz w:val="21"/>
+        </w:rPr>
+        <w:t xml:space="preserve">Penerimaan / tindakan: Definisi unit/periode/reset; uji limit boundary dan request bersamaan, rollback kegagalan, tenant scope serta job; bedakan trial lifecycle dari pemeriksaan status trial yang sudah ada.</w:t>
       </w:r>
     </w:p>
     <w:p>
@@ -1778,31 +1898,31 @@
           <w:rFonts w:ascii="Calibri" w:hAnsi="Calibri"/>
           <w:sz w:val="21"/>
         </w:rPr>
-        <w:t xml:space="preserve">☐ C04 — Webhook terverifikasi dan idempoten · BELUM</w:t>
-      </w:r>
-    </w:p>
-    <w:p>
-      <w:pPr>
-        <w:spacing w:after="100"/>
-      </w:pPr>
-      <w:r>
-        <w:rPr>
-          <w:rFonts w:ascii="Calibri" w:hAnsi="Calibri"/>
-          <w:sz w:val="21"/>
-        </w:rPr>
-        <w:t xml:space="preserve">Status: BELUM | PRD: CORE 03 | Bergantung pada: C03</w:t>
-      </w:r>
-    </w:p>
-    <w:p>
-      <w:pPr>
-        <w:spacing w:after="100"/>
-      </w:pPr>
-      <w:r>
-        <w:rPr>
-          <w:rFonts w:ascii="Calibri" w:hAnsi="Calibri"/>
-          <w:sz w:val="21"/>
-        </w:rPr>
-        <w:t xml:space="preserve">Penerimaan / tindakan: Uji valid/invalid, duplikat, event terlambat/out-of-order, concurrency dan timeout pada database target; satu payment tidak menggandakan akses/invoice.</w:t>
+        <w:t xml:space="preserve">☐ C06 — Media bersama · BELUM</w:t>
+      </w:r>
+    </w:p>
+    <w:p>
+      <w:pPr>
+        <w:spacing w:after="100"/>
+      </w:pPr>
+      <w:r>
+        <w:rPr>
+          <w:rFonts w:ascii="Calibri" w:hAnsi="Calibri"/>
+          <w:sz w:val="21"/>
+        </w:rPr>
+        <w:t xml:space="preserve">Status: BELUM | PRD: CORE 05 | Bergantung pada: D03; D08; aturan quota</w:t>
+      </w:r>
+    </w:p>
+    <w:p>
+      <w:pPr>
+        <w:spacing w:after="100"/>
+      </w:pPr>
+      <w:r>
+        <w:rPr>
+          <w:rFonts w:ascii="Calibri" w:hAnsi="Calibri"/>
+          <w:sz w:val="21"/>
+        </w:rPr>
+        <w:t xml:space="preserve">Penerimaan / tindakan: Validasi MIME/ukuran, kepemilikan tenant, upload storage, signed URL privat dan penghapusan/retensi; uji file invalid, gagal upload dan akses silang.</w:t>
       </w:r>
     </w:p>
     <w:p>
@@ -1838,31 +1958,31 @@
           <w:rFonts w:ascii="Calibri" w:hAnsi="Calibri"/>
           <w:sz w:val="21"/>
         </w:rPr>
-        <w:t xml:space="preserve">☐ C05 — Trial provisioning dan quota atomik · BELUM</w:t>
-      </w:r>
-    </w:p>
-    <w:p>
-      <w:pPr>
-        <w:spacing w:after="100"/>
-      </w:pPr>
-      <w:r>
-        <w:rPr>
-          <w:rFonts w:ascii="Calibri" w:hAnsi="Calibri"/>
-          <w:sz w:val="21"/>
-        </w:rPr>
-        <w:t xml:space="preserve">Status: BELUM | PRD: CORE 04 | Bergantung pada: D02; C01–C02</w:t>
-      </w:r>
-    </w:p>
-    <w:p>
-      <w:pPr>
-        <w:spacing w:after="100"/>
-      </w:pPr>
-      <w:r>
-        <w:rPr>
-          <w:rFonts w:ascii="Calibri" w:hAnsi="Calibri"/>
-          <w:sz w:val="21"/>
-        </w:rPr>
-        <w:t xml:space="preserve">Penerimaan / tindakan: Definisi unit/periode/reset; uji limit boundary dan request bersamaan, rollback kegagalan, tenant scope serta job; bedakan trial lifecycle dari pemeriksaan status trial yang sudah ada.</w:t>
+        <w:t xml:space="preserve">☐ C07 — Notifikasi provider dan queue · BELUM</w:t>
+      </w:r>
+    </w:p>
+    <w:p>
+      <w:pPr>
+        <w:spacing w:after="100"/>
+      </w:pPr>
+      <w:r>
+        <w:rPr>
+          <w:rFonts w:ascii="Calibri" w:hAnsi="Calibri"/>
+          <w:sz w:val="21"/>
+        </w:rPr>
+        <w:t xml:space="preserve">Status: BELUM | PRD: CORE 05 | Bergantung pada: D03; D08</w:t>
+      </w:r>
+    </w:p>
+    <w:p>
+      <w:pPr>
+        <w:spacing w:after="100"/>
+      </w:pPr>
+      <w:r>
+        <w:rPr>
+          <w:rFonts w:ascii="Calibri" w:hAnsi="Calibri"/>
+          <w:sz w:val="21"/>
+        </w:rPr>
+        <w:t xml:space="preserve">Penerimaan / tindakan: Pertahankan lonceng yang ada; tambahkan email/WA hanya sesuai scope; retry terbatas, deduplication, timeout dan visibility failed job; uji pengiriman nyata di staging.</w:t>
       </w:r>
     </w:p>
     <w:p>
@@ -1898,31 +2018,31 @@
           <w:rFonts w:ascii="Calibri" w:hAnsi="Calibri"/>
           <w:sz w:val="21"/>
         </w:rPr>
-        <w:t xml:space="preserve">☐ C06 — Media bersama · BELUM</w:t>
-      </w:r>
-    </w:p>
-    <w:p>
-      <w:pPr>
-        <w:spacing w:after="100"/>
-      </w:pPr>
-      <w:r>
-        <w:rPr>
-          <w:rFonts w:ascii="Calibri" w:hAnsi="Calibri"/>
-          <w:sz w:val="21"/>
-        </w:rPr>
-        <w:t xml:space="preserve">Status: BELUM | PRD: CORE 05 | Bergantung pada: D03; D08; aturan quota</w:t>
-      </w:r>
-    </w:p>
-    <w:p>
-      <w:pPr>
-        <w:spacing w:after="100"/>
-      </w:pPr>
-      <w:r>
-        <w:rPr>
-          <w:rFonts w:ascii="Calibri" w:hAnsi="Calibri"/>
-          <w:sz w:val="21"/>
-        </w:rPr>
-        <w:t xml:space="preserve">Penerimaan / tindakan: Validasi MIME/ukuran, kepemilikan tenant, upload storage, signed URL privat dan penghapusan/retensi; uji file invalid, gagal upload dan akses silang.</w:t>
+        <w:t xml:space="preserve">☐ C08 — Audit, settings dan domain mapping · BELUM</w:t>
+      </w:r>
+    </w:p>
+    <w:p>
+      <w:pPr>
+        <w:spacing w:after="100"/>
+      </w:pPr>
+      <w:r>
+        <w:rPr>
+          <w:rFonts w:ascii="Calibri" w:hAnsi="Calibri"/>
+          <w:sz w:val="21"/>
+        </w:rPr>
+        <w:t xml:space="preserve">Status: BELUM | PRD: CORE 06 | Bergantung pada: D01; D03; D08</w:t>
+      </w:r>
+    </w:p>
+    <w:p>
+      <w:pPr>
+        <w:spacing w:after="100"/>
+      </w:pPr>
+      <w:r>
+        <w:rPr>
+          <w:rFonts w:ascii="Calibri" w:hAnsi="Calibri"/>
+          <w:sz w:val="21"/>
+        </w:rPr>
+        <w:t xml:space="preserve">Penerimaan / tindakan: Audit actor/tenant/object/action/time untuk billing, izin dan publish; settings tervalidasi, domain unik dan terverifikasi sesuai scope; tanpa secret pada log.</w:t>
       </w:r>
     </w:p>
     <w:p>
@@ -1958,31 +2078,31 @@
           <w:rFonts w:ascii="Calibri" w:hAnsi="Calibri"/>
           <w:sz w:val="21"/>
         </w:rPr>
-        <w:t xml:space="preserve">☐ C07 — Notifikasi provider dan queue · BELUM</w:t>
-      </w:r>
-    </w:p>
-    <w:p>
-      <w:pPr>
-        <w:spacing w:after="100"/>
-      </w:pPr>
-      <w:r>
-        <w:rPr>
-          <w:rFonts w:ascii="Calibri" w:hAnsi="Calibri"/>
-          <w:sz w:val="21"/>
-        </w:rPr>
-        <w:t xml:space="preserve">Status: BELUM | PRD: CORE 05 | Bergantung pada: D03; D08</w:t>
-      </w:r>
-    </w:p>
-    <w:p>
-      <w:pPr>
-        <w:spacing w:after="100"/>
-      </w:pPr>
-      <w:r>
-        <w:rPr>
-          <w:rFonts w:ascii="Calibri" w:hAnsi="Calibri"/>
-          <w:sz w:val="21"/>
-        </w:rPr>
-        <w:t xml:space="preserve">Penerimaan / tindakan: Pertahankan lonceng yang ada; tambahkan email/WA hanya sesuai scope; retry terbatas, deduplication, timeout dan visibility failed job; uji pengiriman nyata di staging.</w:t>
+        <w:t xml:space="preserve">☐ C09 — Kolaborasi workspace · DITUNDA</w:t>
+      </w:r>
+    </w:p>
+    <w:p>
+      <w:pPr>
+        <w:spacing w:after="100"/>
+      </w:pPr>
+      <w:r>
+        <w:rPr>
+          <w:rFonts w:ascii="Calibri" w:hAnsi="Calibri"/>
+          <w:sz w:val="21"/>
+        </w:rPr>
+        <w:t xml:space="preserve">Status: DITUNDA | PRD: CORE 01 | Dilanjutkan hanya saat diprioritaskan kembali.</w:t>
+      </w:r>
+    </w:p>
+    <w:p>
+      <w:pPr>
+        <w:spacing w:after="100"/>
+      </w:pPr>
+      <w:r>
+        <w:rPr>
+          <w:rFonts w:ascii="Calibri" w:hAnsi="Calibri"/>
+          <w:sz w:val="21"/>
+        </w:rPr>
+        <w:t xml:space="preserve">Penerimaan / tindakan: Tidak dikerjakan sekarang sesuai arahan pengguna. Undangan anggota, peran anggota dan transfer owner ditinjau kembali bila menjadi prioritas.</w:t>
       </w:r>
     </w:p>
     <w:p>
@@ -2018,139 +2138,19 @@
           <w:rFonts w:ascii="Calibri" w:hAnsi="Calibri"/>
           <w:sz w:val="21"/>
         </w:rPr>
-        <w:t xml:space="preserve">☐ C08 — Audit, settings dan domain mapping · BELUM</w:t>
-      </w:r>
-    </w:p>
-    <w:p>
-      <w:pPr>
-        <w:spacing w:after="100"/>
-      </w:pPr>
-      <w:r>
-        <w:rPr>
-          <w:rFonts w:ascii="Calibri" w:hAnsi="Calibri"/>
-          <w:sz w:val="21"/>
-        </w:rPr>
-        <w:t xml:space="preserve">Status: BELUM | PRD: CORE 06 | Bergantung pada: D01; D03; D08</w:t>
-      </w:r>
-    </w:p>
-    <w:p>
-      <w:pPr>
-        <w:spacing w:after="100"/>
-      </w:pPr>
-      <w:r>
-        <w:rPr>
-          <w:rFonts w:ascii="Calibri" w:hAnsi="Calibri"/>
-          <w:sz w:val="21"/>
-        </w:rPr>
-        <w:t xml:space="preserve">Penerimaan / tindakan: Audit actor/tenant/object/action/time untuk billing, izin dan publish; settings tervalidasi, domain unik dan terverifikasi sesuai scope; tanpa secret pada log.</w:t>
-      </w:r>
-    </w:p>
-    <w:p>
-      <w:pPr>
-        <w:spacing w:after="100"/>
-      </w:pPr>
-      <w:r>
-        <w:rPr>
-          <w:rFonts w:ascii="Calibri" w:hAnsi="Calibri"/>
-          <w:sz w:val="21"/>
-        </w:rPr>
-        <w:t xml:space="preserve">Bukti awal / lokasi: Tambahkan tautan implementasi, migration dan hasil tes saat dikerjakan.</w:t>
-      </w:r>
-    </w:p>
-    <w:p>
-      <w:pPr>
-        <w:spacing w:after="100"/>
-      </w:pPr>
-      <w:r>
-        <w:rPr>
-          <w:rFonts w:ascii="Calibri" w:hAnsi="Calibri"/>
-          <w:sz w:val="21"/>
-        </w:rPr>
-        <w:t xml:space="preserve">PIC: __________ · Tanggal: __________ · Bukti/hasil: __________</w:t>
-      </w:r>
-    </w:p>
-    <w:p>
-      <w:pPr>
-        <w:spacing w:after="100"/>
-      </w:pPr>
-      <w:r>
-        <w:rPr>
-          <w:rFonts w:ascii="Calibri" w:hAnsi="Calibri"/>
-          <w:sz w:val="21"/>
-        </w:rPr>
-        <w:t xml:space="preserve">☐ C09 — Kolaborasi workspace · DITUNDA</w:t>
-      </w:r>
-    </w:p>
-    <w:p>
-      <w:pPr>
-        <w:spacing w:after="100"/>
-      </w:pPr>
-      <w:r>
-        <w:rPr>
-          <w:rFonts w:ascii="Calibri" w:hAnsi="Calibri"/>
-          <w:sz w:val="21"/>
-        </w:rPr>
-        <w:t xml:space="preserve">Status: DITUNDA | PRD: CORE 01 | Dilanjutkan hanya saat diprioritaskan kembali.</w:t>
-      </w:r>
-    </w:p>
-    <w:p>
-      <w:pPr>
-        <w:spacing w:after="100"/>
-      </w:pPr>
-      <w:r>
-        <w:rPr>
-          <w:rFonts w:ascii="Calibri" w:hAnsi="Calibri"/>
-          <w:sz w:val="21"/>
-        </w:rPr>
-        <w:t xml:space="preserve">Penerimaan / tindakan: Tidak dikerjakan sekarang sesuai arahan pengguna. Undangan anggota, peran anggota dan transfer owner ditinjau kembali bila menjadi prioritas.</w:t>
-      </w:r>
-    </w:p>
-    <w:p>
-      <w:pPr>
-        <w:spacing w:after="100"/>
-      </w:pPr>
-      <w:r>
-        <w:rPr>
-          <w:rFonts w:ascii="Calibri" w:hAnsi="Calibri"/>
-          <w:sz w:val="21"/>
-        </w:rPr>
-        <w:t xml:space="preserve">Bukti awal / lokasi: Tambahkan tautan implementasi, migration dan hasil tes saat dikerjakan.</w:t>
-      </w:r>
-    </w:p>
-    <w:p>
-      <w:pPr>
-        <w:spacing w:after="100"/>
-      </w:pPr>
-      <w:r>
-        <w:rPr>
-          <w:rFonts w:ascii="Calibri" w:hAnsi="Calibri"/>
-          <w:sz w:val="21"/>
-        </w:rPr>
-        <w:t xml:space="preserve">PIC: __________ · Tanggal: __________ · Bukti/hasil: __________</w:t>
-      </w:r>
-    </w:p>
-    <w:p>
-      <w:pPr>
-        <w:spacing w:after="100"/>
-      </w:pPr>
-      <w:r>
-        <w:rPr>
-          <w:rFonts w:ascii="Calibri" w:hAnsi="Calibri"/>
-          <w:sz w:val="21"/>
-        </w:rPr>
-        <w:t xml:space="preserve">☐ C10 — Kontrak dashboard produk · BELUM</w:t>
-      </w:r>
-    </w:p>
-    <w:p>
-      <w:pPr>
-        <w:spacing w:after="100"/>
-      </w:pPr>
-      <w:r>
-        <w:rPr>
-          <w:rFonts w:ascii="Calibri" w:hAnsi="Calibri"/>
-          <w:sz w:val="21"/>
-        </w:rPr>
-        <w:t xml:space="preserve">Status: BELUM | PRD: CORE 02/04 | Bergantung pada: S02; S06; D01</w:t>
+        <w:t xml:space="preserve">☐ C10 — Kontrak dashboard produk · SEBAGIAN</w:t>
+      </w:r>
+    </w:p>
+    <w:p>
+      <w:pPr>
+        <w:spacing w:after="100"/>
+      </w:pPr>
+      <w:r>
+        <w:rPr>
+          <w:rFonts w:ascii="Calibri" w:hAnsi="Calibri"/>
+          <w:sz w:val="21"/>
+        </w:rPr>
+        <w:t xml:space="preserve">Status: SEBAGIAN | PRD: CORE 02/04 | Bergantung pada: S02; S06; D01</w:t>
       </w:r>
     </w:p>
     <w:p>
@@ -2174,7 +2174,7 @@
           <w:rFonts w:ascii="Calibri" w:hAnsi="Calibri"/>
           <w:sz w:val="21"/>
         </w:rPr>
-        <w:t xml:space="preserve">Bukti awal / lokasi: Tambahkan tautan implementasi, migration dan hasil tes saat dikerjakan.</w:t>
+        <w:t xml:space="preserve">Bukti awal / lokasi: Route Wedding memakai sesi bersama, owner/workspace dan entitlement; tes lintas tenant tersedia. Kontrak produk lain belum diimplementasikan. Detail: WEDDING_LIFECYCLE.md.</w:t>
       </w:r>
     </w:p>
     <w:p>
@@ -2213,19 +2213,19 @@
           <w:rFonts w:ascii="Calibri" w:hAnsi="Calibri"/>
           <w:sz w:val="21"/>
         </w:rPr>
-        <w:t xml:space="preserve">☐ W01 — Dashboard dan template · BELUM</w:t>
-      </w:r>
-    </w:p>
-    <w:p>
-      <w:pPr>
-        <w:spacing w:after="100"/>
-      </w:pPr>
-      <w:r>
-        <w:rPr>
-          <w:rFonts w:ascii="Calibri" w:hAnsi="Calibri"/>
-          <w:sz w:val="21"/>
-        </w:rPr>
-        <w:t xml:space="preserve">Status: BELUM | PRD: WED 01 | Bergantung pada: C10; D04</w:t>
+        <w:t xml:space="preserve">☐ W01 — Dashboard dan template · SEBAGIAN</w:t>
+      </w:r>
+    </w:p>
+    <w:p>
+      <w:pPr>
+        <w:spacing w:after="100"/>
+      </w:pPr>
+      <w:r>
+        <w:rPr>
+          <w:rFonts w:ascii="Calibri" w:hAnsi="Calibri"/>
+          <w:sz w:val="21"/>
+        </w:rPr>
+        <w:t xml:space="preserve">Status: SEBAGIAN | PRD: WED 01 | Bergantung pada: C10; D04</w:t>
       </w:r>
     </w:p>
     <w:p>
@@ -2249,6 +2249,186 @@
           <w:rFonts w:ascii="Calibri" w:hAnsi="Calibri"/>
           <w:sz w:val="21"/>
         </w:rPr>
+        <w:t xml:space="preserve">Bukti awal / lokasi: Editor/dashboard Wedding dasar dengan satu tampilan; pemilihan template belum tersedia. Detail: WEDDING_LIFECYCLE.md.</w:t>
+      </w:r>
+    </w:p>
+    <w:p>
+      <w:pPr>
+        <w:spacing w:after="100"/>
+      </w:pPr>
+      <w:r>
+        <w:rPr>
+          <w:rFonts w:ascii="Calibri" w:hAnsi="Calibri"/>
+          <w:sz w:val="21"/>
+        </w:rPr>
+        <w:t xml:space="preserve">PIC: __________ · Tanggal: __________ · Bukti/hasil: __________</w:t>
+      </w:r>
+    </w:p>
+    <w:p>
+      <w:pPr>
+        <w:spacing w:after="100"/>
+      </w:pPr>
+      <w:r>
+        <w:rPr>
+          <w:rFonts w:ascii="Calibri" w:hAnsi="Calibri"/>
+          <w:sz w:val="21"/>
+        </w:rPr>
+        <w:t xml:space="preserve">☐ W02 — Editor konten dan media · SEBAGIAN</w:t>
+      </w:r>
+    </w:p>
+    <w:p>
+      <w:pPr>
+        <w:spacing w:after="100"/>
+      </w:pPr>
+      <w:r>
+        <w:rPr>
+          <w:rFonts w:ascii="Calibri" w:hAnsi="Calibri"/>
+          <w:sz w:val="21"/>
+        </w:rPr>
+        <w:t xml:space="preserve">Status: SEBAGIAN | PRD: WED 02 | Bergantung pada: W01; C06</w:t>
+      </w:r>
+    </w:p>
+    <w:p>
+      <w:pPr>
+        <w:spacing w:after="100"/>
+      </w:pPr>
+      <w:r>
+        <w:rPr>
+          <w:rFonts w:ascii="Calibri" w:hAnsi="Calibri"/>
+          <w:sz w:val="21"/>
+        </w:rPr>
+        <w:t xml:space="preserve">Penerimaan / tindakan: Data pasangan/event/lokasi/tema/media sesuai field final; validasi server dan sanitasi; simpan serta tampilkan kembali tanpa script pengguna.</w:t>
+      </w:r>
+    </w:p>
+    <w:p>
+      <w:pPr>
+        <w:spacing w:after="100"/>
+      </w:pPr>
+      <w:r>
+        <w:rPr>
+          <w:rFonts w:ascii="Calibri" w:hAnsi="Calibri"/>
+          <w:sz w:val="21"/>
+        </w:rPr>
+        <w:t xml:space="preserve">Bukti awal / lokasi: Nama pasangan, tanggal, lokasi dan pesan tersedia; validasi server serta escaping. Upload media dan scope konten lengkap belum. Detail: WEDDING_LIFECYCLE.md.</w:t>
+      </w:r>
+    </w:p>
+    <w:p>
+      <w:pPr>
+        <w:spacing w:after="100"/>
+      </w:pPr>
+      <w:r>
+        <w:rPr>
+          <w:rFonts w:ascii="Calibri" w:hAnsi="Calibri"/>
+          <w:sz w:val="21"/>
+        </w:rPr>
+        <w:t xml:space="preserve">PIC: __________ · Tanggal: __________ · Bukti/hasil: __________</w:t>
+      </w:r>
+    </w:p>
+    <w:p>
+      <w:pPr>
+        <w:spacing w:after="100"/>
+      </w:pPr>
+      <w:r>
+        <w:rPr>
+          <w:rFonts w:ascii="Calibri" w:hAnsi="Calibri"/>
+          <w:sz w:val="21"/>
+        </w:rPr>
+        <w:t xml:space="preserve">☑ W03 — Preview privat · TERSEDIA</w:t>
+      </w:r>
+    </w:p>
+    <w:p>
+      <w:pPr>
+        <w:spacing w:after="100"/>
+      </w:pPr>
+      <w:r>
+        <w:rPr>
+          <w:rFonts w:ascii="Calibri" w:hAnsi="Calibri"/>
+          <w:sz w:val="21"/>
+        </w:rPr>
+        <w:t xml:space="preserve">Status: TERSEDIA | PRD: WED 03 | Bergantung pada: W02</w:t>
+      </w:r>
+    </w:p>
+    <w:p>
+      <w:pPr>
+        <w:spacing w:after="100"/>
+      </w:pPr>
+      <w:r>
+        <w:rPr>
+          <w:rFonts w:ascii="Calibri" w:hAnsi="Calibri"/>
+          <w:sz w:val="21"/>
+        </w:rPr>
+        <w:t xml:space="preserve">Penerimaan / tindakan: Preview hanya untuk pihak berwenang atau mekanisme terbatas yang disepakati; draft tidak bocor; data tersimpan tampil benar.</w:t>
+      </w:r>
+    </w:p>
+    <w:p>
+      <w:pPr>
+        <w:spacing w:after="100"/>
+      </w:pPr>
+      <w:r>
+        <w:rPr>
+          <w:rFonts w:ascii="Calibri" w:hAnsi="Calibri"/>
+          <w:sz w:val="21"/>
+        </w:rPr>
+        <w:t xml:space="preserve">Bukti awal / lokasi: Preview privat owner terverifikasi, konten draft terpisah dari publik; pengujian penolakan lintas tenant lulus. UAT browser masih terbuka. Detail: WEDDING_LIFECYCLE.md.</w:t>
+      </w:r>
+    </w:p>
+    <w:p>
+      <w:pPr>
+        <w:spacing w:after="100"/>
+      </w:pPr>
+      <w:r>
+        <w:rPr>
+          <w:rFonts w:ascii="Calibri" w:hAnsi="Calibri"/>
+          <w:sz w:val="21"/>
+        </w:rPr>
+        <w:t xml:space="preserve">PIC: __________ · Tanggal: __________ · Bukti/hasil: __________</w:t>
+      </w:r>
+    </w:p>
+    <w:p>
+      <w:pPr>
+        <w:spacing w:after="100"/>
+      </w:pPr>
+      <w:r>
+        <w:rPr>
+          <w:rFonts w:ascii="Calibri" w:hAnsi="Calibri"/>
+          <w:sz w:val="21"/>
+        </w:rPr>
+        <w:t xml:space="preserve">☐ W04 — Publish subdomain HTTPS · BELUM</w:t>
+      </w:r>
+    </w:p>
+    <w:p>
+      <w:pPr>
+        <w:spacing w:after="100"/>
+      </w:pPr>
+      <w:r>
+        <w:rPr>
+          <w:rFonts w:ascii="Calibri" w:hAnsi="Calibri"/>
+          <w:sz w:val="21"/>
+        </w:rPr>
+        <w:t xml:space="preserve">Status: BELUM | PRD: WED 03 | Bergantung pada: W03; C05; C08; D03</w:t>
+      </w:r>
+    </w:p>
+    <w:p>
+      <w:pPr>
+        <w:spacing w:after="100"/>
+      </w:pPr>
+      <w:r>
+        <w:rPr>
+          <w:rFonts w:ascii="Calibri" w:hAnsi="Calibri"/>
+          <w:sz w:val="21"/>
+        </w:rPr>
+        <w:t xml:space="preserve">Penerimaan / tindakan: Subdomain unik, entitlement/kuota dicek; publish gagal tidak dicatat sukses; alamat publik menampilkan versi yang benar.</w:t>
+      </w:r>
+    </w:p>
+    <w:p>
+      <w:pPr>
+        <w:spacing w:after="100"/>
+      </w:pPr>
+      <w:r>
+        <w:rPr>
+          <w:rFonts w:ascii="Calibri" w:hAnsi="Calibri"/>
+          <w:sz w:val="21"/>
+        </w:rPr>
         <w:t xml:space="preserve">Bukti awal / lokasi: Belum ada modul bisnis Wedding pada source yang diperiksa.</w:t>
       </w:r>
     </w:p>
@@ -2273,31 +2453,91 @@
           <w:rFonts w:ascii="Calibri" w:hAnsi="Calibri"/>
           <w:sz w:val="21"/>
         </w:rPr>
-        <w:t xml:space="preserve">☐ W02 — Editor konten dan media · BELUM</w:t>
-      </w:r>
-    </w:p>
-    <w:p>
-      <w:pPr>
-        <w:spacing w:after="100"/>
-      </w:pPr>
-      <w:r>
-        <w:rPr>
-          <w:rFonts w:ascii="Calibri" w:hAnsi="Calibri"/>
-          <w:sz w:val="21"/>
-        </w:rPr>
-        <w:t xml:space="preserve">Status: BELUM | PRD: WED 02 | Bergantung pada: W01; C06</w:t>
-      </w:r>
-    </w:p>
-    <w:p>
-      <w:pPr>
-        <w:spacing w:after="100"/>
-      </w:pPr>
-      <w:r>
-        <w:rPr>
-          <w:rFonts w:ascii="Calibri" w:hAnsi="Calibri"/>
-          <w:sz w:val="21"/>
-        </w:rPr>
-        <w:t xml:space="preserve">Penerimaan / tindakan: Data pasangan/event/lokasi/tema/media sesuai field final; validasi server dan sanitasi; simpan serta tampilkan kembali tanpa script pengguna.</w:t>
+        <w:t xml:space="preserve">☐ W05 — Lifecycle dan kegagalan publish · SEBAGIAN</w:t>
+      </w:r>
+    </w:p>
+    <w:p>
+      <w:pPr>
+        <w:spacing w:after="100"/>
+      </w:pPr>
+      <w:r>
+        <w:rPr>
+          <w:rFonts w:ascii="Calibri" w:hAnsi="Calibri"/>
+          <w:sz w:val="21"/>
+        </w:rPr>
+        <w:t xml:space="preserve">Status: SEBAGIAN | PRD: WED 03 | Bergantung pada: W04; D02</w:t>
+      </w:r>
+    </w:p>
+    <w:p>
+      <w:pPr>
+        <w:spacing w:after="100"/>
+      </w:pPr>
+      <w:r>
+        <w:rPr>
+          <w:rFonts w:ascii="Calibri" w:hAnsi="Calibri"/>
+          <w:sz w:val="21"/>
+        </w:rPr>
+        <w:t xml:space="preserve">Penerimaan / tindakan: Uji publish ulang/unpublish, subdomain bentrok, upload gagal, expiry dan akses lintas tenant; konsistensi quota saat gagal/concurrent.</w:t>
+      </w:r>
+    </w:p>
+    <w:p>
+      <w:pPr>
+        <w:spacing w:after="100"/>
+      </w:pPr>
+      <w:r>
+        <w:rPr>
+          <w:rFonts w:ascii="Calibri" w:hAnsi="Calibri"/>
+          <w:sz w:val="21"/>
+        </w:rPr>
+        <w:t xml:space="preserve">Bukti awal / lokasi: Publish ulang mempertahankan periode, expiry menutup publik, pembelian ulang memakai undangan lama. Unpublish, DNS, quota dan concurrency belum diuji. Detail: WEDDING_LIFECYCLE.md.</w:t>
+      </w:r>
+    </w:p>
+    <w:p>
+      <w:pPr>
+        <w:spacing w:after="100"/>
+      </w:pPr>
+      <w:r>
+        <w:rPr>
+          <w:rFonts w:ascii="Calibri" w:hAnsi="Calibri"/>
+          <w:sz w:val="21"/>
+        </w:rPr>
+        <w:t xml:space="preserve">PIC: __________ · Tanggal: __________ · Bukti/hasil: __________</w:t>
+      </w:r>
+    </w:p>
+    <w:p>
+      <w:pPr>
+        <w:spacing w:after="100"/>
+      </w:pPr>
+      <w:r>
+        <w:rPr>
+          <w:rFonts w:ascii="Calibri" w:hAnsi="Calibri"/>
+          <w:sz w:val="21"/>
+        </w:rPr>
+        <w:t xml:space="preserve">☐ W06 — Guest, RSVP dan wishes · OPSIONAL</w:t>
+      </w:r>
+    </w:p>
+    <w:p>
+      <w:pPr>
+        <w:spacing w:after="100"/>
+      </w:pPr>
+      <w:r>
+        <w:rPr>
+          <w:rFonts w:ascii="Calibri" w:hAnsi="Calibri"/>
+          <w:sz w:val="21"/>
+        </w:rPr>
+        <w:t xml:space="preserve">Status: OPSIONAL | PRD: WED 04 | Bergantung pada: D04; W04</w:t>
+      </w:r>
+    </w:p>
+    <w:p>
+      <w:pPr>
+        <w:spacing w:after="100"/>
+      </w:pPr>
+      <w:r>
+        <w:rPr>
+          <w:rFonts w:ascii="Calibri" w:hAnsi="Calibri"/>
+          <w:sz w:val="21"/>
+        </w:rPr>
+        <w:t xml:space="preserve">Penerimaan / tindakan: Hanya jika masuk scope: respons tervalidasi/rate-limited, daftar tamu tetap privat, owner melihat respons undangannya.</w:t>
       </w:r>
     </w:p>
     <w:p>
@@ -2333,31 +2573,31 @@
           <w:rFonts w:ascii="Calibri" w:hAnsi="Calibri"/>
           <w:sz w:val="21"/>
         </w:rPr>
-        <w:t xml:space="preserve">☐ W03 — Preview privat · BELUM</w:t>
-      </w:r>
-    </w:p>
-    <w:p>
-      <w:pPr>
-        <w:spacing w:after="100"/>
-      </w:pPr>
-      <w:r>
-        <w:rPr>
-          <w:rFonts w:ascii="Calibri" w:hAnsi="Calibri"/>
-          <w:sz w:val="21"/>
-        </w:rPr>
-        <w:t xml:space="preserve">Status: BELUM | PRD: WED 03 | Bergantung pada: W02</w:t>
-      </w:r>
-    </w:p>
-    <w:p>
-      <w:pPr>
-        <w:spacing w:after="100"/>
-      </w:pPr>
-      <w:r>
-        <w:rPr>
-          <w:rFonts w:ascii="Calibri" w:hAnsi="Calibri"/>
-          <w:sz w:val="21"/>
-        </w:rPr>
-        <w:t xml:space="preserve">Penerimaan / tindakan: Preview hanya untuk pihak berwenang atau mekanisme terbatas yang disepakati; draft tidak bocor; data tersimpan tampil benar.</w:t>
+        <w:t xml:space="preserve">☐ W07 — UAT Wedding end-to-end · BELUM</w:t>
+      </w:r>
+    </w:p>
+    <w:p>
+      <w:pPr>
+        <w:spacing w:after="100"/>
+      </w:pPr>
+      <w:r>
+        <w:rPr>
+          <w:rFonts w:ascii="Calibri" w:hAnsi="Calibri"/>
+          <w:sz w:val="21"/>
+        </w:rPr>
+        <w:t xml:space="preserve">Status: BELUM | PRD: WED 01–03; CORE 01–06 | Bergantung pada: C01–C08; W01–W05; R01–R06</w:t>
+      </w:r>
+    </w:p>
+    <w:p>
+      <w:pPr>
+        <w:spacing w:after="100"/>
+      </w:pPr>
+      <w:r>
+        <w:rPr>
+          <w:rFonts w:ascii="Calibri" w:hAnsi="Calibri"/>
+          <w:sz w:val="21"/>
+        </w:rPr>
+        <w:t xml:space="preserve">Penerimaan / tindakan: Daftar → bayar → entitlement → konten → preview → publish pada staging; uji gagal/akses ilegal; catat persetujuan owner sebelum rilis.</w:t>
       </w:r>
     </w:p>
     <w:p>
@@ -2393,246 +2633,6 @@
           <w:rFonts w:ascii="Calibri" w:hAnsi="Calibri"/>
           <w:sz w:val="21"/>
         </w:rPr>
-        <w:t xml:space="preserve">☐ W04 — Publish subdomain HTTPS · BELUM</w:t>
-      </w:r>
-    </w:p>
-    <w:p>
-      <w:pPr>
-        <w:spacing w:after="100"/>
-      </w:pPr>
-      <w:r>
-        <w:rPr>
-          <w:rFonts w:ascii="Calibri" w:hAnsi="Calibri"/>
-          <w:sz w:val="21"/>
-        </w:rPr>
-        <w:t xml:space="preserve">Status: BELUM | PRD: WED 03 | Bergantung pada: W03; C05; C08; D03</w:t>
-      </w:r>
-    </w:p>
-    <w:p>
-      <w:pPr>
-        <w:spacing w:after="100"/>
-      </w:pPr>
-      <w:r>
-        <w:rPr>
-          <w:rFonts w:ascii="Calibri" w:hAnsi="Calibri"/>
-          <w:sz w:val="21"/>
-        </w:rPr>
-        <w:t xml:space="preserve">Penerimaan / tindakan: Subdomain unik, entitlement/kuota dicek; publish gagal tidak dicatat sukses; alamat publik menampilkan versi yang benar.</w:t>
-      </w:r>
-    </w:p>
-    <w:p>
-      <w:pPr>
-        <w:spacing w:after="100"/>
-      </w:pPr>
-      <w:r>
-        <w:rPr>
-          <w:rFonts w:ascii="Calibri" w:hAnsi="Calibri"/>
-          <w:sz w:val="21"/>
-        </w:rPr>
-        <w:t xml:space="preserve">Bukti awal / lokasi: Belum ada modul bisnis Wedding pada source yang diperiksa.</w:t>
-      </w:r>
-    </w:p>
-    <w:p>
-      <w:pPr>
-        <w:spacing w:after="100"/>
-      </w:pPr>
-      <w:r>
-        <w:rPr>
-          <w:rFonts w:ascii="Calibri" w:hAnsi="Calibri"/>
-          <w:sz w:val="21"/>
-        </w:rPr>
-        <w:t xml:space="preserve">PIC: __________ · Tanggal: __________ · Bukti/hasil: __________</w:t>
-      </w:r>
-    </w:p>
-    <w:p>
-      <w:pPr>
-        <w:spacing w:after="100"/>
-      </w:pPr>
-      <w:r>
-        <w:rPr>
-          <w:rFonts w:ascii="Calibri" w:hAnsi="Calibri"/>
-          <w:sz w:val="21"/>
-        </w:rPr>
-        <w:t xml:space="preserve">☐ W05 — Lifecycle dan kegagalan publish · BELUM</w:t>
-      </w:r>
-    </w:p>
-    <w:p>
-      <w:pPr>
-        <w:spacing w:after="100"/>
-      </w:pPr>
-      <w:r>
-        <w:rPr>
-          <w:rFonts w:ascii="Calibri" w:hAnsi="Calibri"/>
-          <w:sz w:val="21"/>
-        </w:rPr>
-        <w:t xml:space="preserve">Status: BELUM | PRD: WED 03 | Bergantung pada: W04; D02</w:t>
-      </w:r>
-    </w:p>
-    <w:p>
-      <w:pPr>
-        <w:spacing w:after="100"/>
-      </w:pPr>
-      <w:r>
-        <w:rPr>
-          <w:rFonts w:ascii="Calibri" w:hAnsi="Calibri"/>
-          <w:sz w:val="21"/>
-        </w:rPr>
-        <w:t xml:space="preserve">Penerimaan / tindakan: Uji publish ulang/unpublish, subdomain bentrok, upload gagal, expiry dan akses lintas tenant; konsistensi quota saat gagal/concurrent.</w:t>
-      </w:r>
-    </w:p>
-    <w:p>
-      <w:pPr>
-        <w:spacing w:after="100"/>
-      </w:pPr>
-      <w:r>
-        <w:rPr>
-          <w:rFonts w:ascii="Calibri" w:hAnsi="Calibri"/>
-          <w:sz w:val="21"/>
-        </w:rPr>
-        <w:t xml:space="preserve">Bukti awal / lokasi: Belum ada modul bisnis Wedding pada source yang diperiksa.</w:t>
-      </w:r>
-    </w:p>
-    <w:p>
-      <w:pPr>
-        <w:spacing w:after="100"/>
-      </w:pPr>
-      <w:r>
-        <w:rPr>
-          <w:rFonts w:ascii="Calibri" w:hAnsi="Calibri"/>
-          <w:sz w:val="21"/>
-        </w:rPr>
-        <w:t xml:space="preserve">PIC: __________ · Tanggal: __________ · Bukti/hasil: __________</w:t>
-      </w:r>
-    </w:p>
-    <w:p>
-      <w:pPr>
-        <w:spacing w:after="100"/>
-      </w:pPr>
-      <w:r>
-        <w:rPr>
-          <w:rFonts w:ascii="Calibri" w:hAnsi="Calibri"/>
-          <w:sz w:val="21"/>
-        </w:rPr>
-        <w:t xml:space="preserve">☐ W06 — Guest, RSVP dan wishes · OPSIONAL</w:t>
-      </w:r>
-    </w:p>
-    <w:p>
-      <w:pPr>
-        <w:spacing w:after="100"/>
-      </w:pPr>
-      <w:r>
-        <w:rPr>
-          <w:rFonts w:ascii="Calibri" w:hAnsi="Calibri"/>
-          <w:sz w:val="21"/>
-        </w:rPr>
-        <w:t xml:space="preserve">Status: OPSIONAL | PRD: WED 04 | Bergantung pada: D04; W04</w:t>
-      </w:r>
-    </w:p>
-    <w:p>
-      <w:pPr>
-        <w:spacing w:after="100"/>
-      </w:pPr>
-      <w:r>
-        <w:rPr>
-          <w:rFonts w:ascii="Calibri" w:hAnsi="Calibri"/>
-          <w:sz w:val="21"/>
-        </w:rPr>
-        <w:t xml:space="preserve">Penerimaan / tindakan: Hanya jika masuk scope: respons tervalidasi/rate-limited, daftar tamu tetap privat, owner melihat respons undangannya.</w:t>
-      </w:r>
-    </w:p>
-    <w:p>
-      <w:pPr>
-        <w:spacing w:after="100"/>
-      </w:pPr>
-      <w:r>
-        <w:rPr>
-          <w:rFonts w:ascii="Calibri" w:hAnsi="Calibri"/>
-          <w:sz w:val="21"/>
-        </w:rPr>
-        <w:t xml:space="preserve">Bukti awal / lokasi: Belum ada modul bisnis Wedding pada source yang diperiksa.</w:t>
-      </w:r>
-    </w:p>
-    <w:p>
-      <w:pPr>
-        <w:spacing w:after="100"/>
-      </w:pPr>
-      <w:r>
-        <w:rPr>
-          <w:rFonts w:ascii="Calibri" w:hAnsi="Calibri"/>
-          <w:sz w:val="21"/>
-        </w:rPr>
-        <w:t xml:space="preserve">PIC: __________ · Tanggal: __________ · Bukti/hasil: __________</w:t>
-      </w:r>
-    </w:p>
-    <w:p>
-      <w:pPr>
-        <w:spacing w:after="100"/>
-      </w:pPr>
-      <w:r>
-        <w:rPr>
-          <w:rFonts w:ascii="Calibri" w:hAnsi="Calibri"/>
-          <w:sz w:val="21"/>
-        </w:rPr>
-        <w:t xml:space="preserve">☐ W07 — UAT Wedding end-to-end · BELUM</w:t>
-      </w:r>
-    </w:p>
-    <w:p>
-      <w:pPr>
-        <w:spacing w:after="100"/>
-      </w:pPr>
-      <w:r>
-        <w:rPr>
-          <w:rFonts w:ascii="Calibri" w:hAnsi="Calibri"/>
-          <w:sz w:val="21"/>
-        </w:rPr>
-        <w:t xml:space="preserve">Status: BELUM | PRD: WED 01–03; CORE 01–06 | Bergantung pada: C01–C08; W01–W05; R01–R06</w:t>
-      </w:r>
-    </w:p>
-    <w:p>
-      <w:pPr>
-        <w:spacing w:after="100"/>
-      </w:pPr>
-      <w:r>
-        <w:rPr>
-          <w:rFonts w:ascii="Calibri" w:hAnsi="Calibri"/>
-          <w:sz w:val="21"/>
-        </w:rPr>
-        <w:t xml:space="preserve">Penerimaan / tindakan: Daftar → bayar → entitlement → konten → preview → publish pada staging; uji gagal/akses ilegal; catat persetujuan owner sebelum rilis.</w:t>
-      </w:r>
-    </w:p>
-    <w:p>
-      <w:pPr>
-        <w:spacing w:after="100"/>
-      </w:pPr>
-      <w:r>
-        <w:rPr>
-          <w:rFonts w:ascii="Calibri" w:hAnsi="Calibri"/>
-          <w:sz w:val="21"/>
-        </w:rPr>
-        <w:t xml:space="preserve">Bukti awal / lokasi: Belum ada modul bisnis Wedding pada source yang diperiksa.</w:t>
-      </w:r>
-    </w:p>
-    <w:p>
-      <w:pPr>
-        <w:spacing w:after="100"/>
-      </w:pPr>
-      <w:r>
-        <w:rPr>
-          <w:rFonts w:ascii="Calibri" w:hAnsi="Calibri"/>
-          <w:sz w:val="21"/>
-        </w:rPr>
-        <w:t xml:space="preserve">PIC: __________ · Tanggal: __________ · Bukti/hasil: __________</w:t>
-      </w:r>
-    </w:p>
-    <w:p>
-      <w:pPr>
-        <w:spacing w:after="100"/>
-      </w:pPr>
-      <w:r>
-        <w:rPr>
-          <w:rFonts w:ascii="Calibri" w:hAnsi="Calibri"/>
-          <w:sz w:val="21"/>
-        </w:rPr>
         <w:t xml:space="preserve">☐ W08 — Builder lanjutan dan custom domain · OPSIONAL</w:t>
       </w:r>
     </w:p>
@@ -2657,7 +2657,7 @@
           <w:rFonts w:ascii="Calibri" w:hAnsi="Calibri"/>
           <w:sz w:val="21"/>
         </w:rPr>
-        <w:t xml:space="preserve">Penerimaan / tindakan: Opsional P2: verifikasi domain/HTTPS, kompatibilitas template dan builder; bukan syarat rilis pertama.</w:t>
+        <w:t xml:space="preserve">Penerimaan / tindakan: Builder lanjutan/otomasi domain opsional P2. Domain .com manual paket Diamond tetap harus dipenuhi pada C08/W04 sebelum penawaran komersial; bukan manfaat opsional.</w:t>
       </w:r>
     </w:p>
     <w:p>

</xml_diff>

<commit_message>
UPDATE MOSHIA TAMPILAN USER - 08102026
</commit_message>
<xml_diff>
--- a/docs/planning/MOSHIACHEKLIST.docx
+++ b/docs/planning/MOSHIACHEKLIST.docx
@@ -3,6 +3,11 @@
 <w:document xmlns:wpc="http://schemas.microsoft.com/office/word/2010/wordprocessingCanvas" xmlns:mo="http://schemas.microsoft.com/office/mac/office/2008/main" xmlns:mc="http://schemas.openxmlformats.org/markup-compatibility/2006" xmlns:mv="urn:schemas-microsoft-com:mac:vml" xmlns:o="urn:schemas-microsoft-com:office:office" xmlns:r="http://schemas.openxmlformats.org/officeDocument/2006/relationships" xmlns:m="http://schemas.openxmlformats.org/officeDocument/2006/math" xmlns:v="urn:schemas-microsoft-com:vml" xmlns:wp14="http://schemas.microsoft.com/office/word/2010/wordprocessingDrawing" xmlns:wp="http://schemas.openxmlformats.org/drawingml/2006/wordprocessingDrawing" xmlns:w10="urn:schemas-microsoft-com:office:word" xmlns:w="http://schemas.openxmlformats.org/wordprocessingml/2006/main" xmlns:w14="http://schemas.microsoft.com/office/word/2010/wordml" xmlns:wpg="http://schemas.microsoft.com/office/word/2010/wordprocessingGroup" xmlns:wpi="http://schemas.microsoft.com/office/word/2010/wordprocessingInk" xmlns:wne="http://schemas.microsoft.com/office/word/2006/wordml" xmlns:wps="http://schemas.microsoft.com/office/word/2010/wordprocessingShape" mc:Ignorable="w14 wp14">
   <w:body>
     <w:p>
+      <w:r>
+        <w:t>Audit 8 Oktober 2026: 187 tes / 1.640 assertions lulus; migration 000011 Ran; build disetujui dan berhasil 807 modul. W05 dilanjutkan dengan Unpublish: halaman/media/respons publik ditutup; data dan masa aktif tetap. W05 sebagian; UAT browser dan concurrency MySQL belum selesai.</w:t>
+      </w:r>
+    </w:p>
+    <w:p>
       <w:pPr>
         <w:spacing w:after="100"/>
         <w:keepNext/>
@@ -215,7 +220,7 @@
           <w:rFonts w:ascii="Calibri" w:hAnsi="Calibri"/>
           <w:sz w:val="21"/>
         </w:rPr>
-        <w:t xml:space="preserve">Status saat ini: 9 item tersedia (S01-S08 dan W03) dicentang; 45 belum dicentang. Rincian: 9 sebagian, 15 belum, 6 menunggu keputusan, 10 perlu verifikasi, 1 ditunda, 4 opsional. Ini jumlah item, bukan persentase project. Hasil terbaru: 168 tes / 1.311 assertions; build 800 modul. UAT belum dilakukan.</w:t>
+        <w:t xml:space="preserve">Status saat ini: 11 item tersedia (S01-S08, W01-W03) dicentang; 43 belum dicentang. Ini jumlah item, bukan persentase project. Suite terbaru: 187 tes / 1.640 assertions; build 807 modul. Preview browser fixture desktop/mobile diperiksa; UAT alur nyata belum selesai.</w:t>
       </w:r>
     </w:p>
     <w:p>
@@ -266,19 +271,19 @@
           <w:rFonts w:ascii="Calibri" w:hAnsi="Calibri"/>
           <w:sz w:val="21"/>
         </w:rPr>
-        <w:t xml:space="preserve">- Tes otomatis: 168 passed, 1.311 assertions, SQLite in-memory. Mencakup pembayaran manual, batas expiry, reaktivasi, isolasi tenant dan rollback.</w:t>
-      </w:r>
-    </w:p>
-    <w:p>
-      <w:pPr>
-        <w:spacing w:after="100"/>
-      </w:pPr>
-      <w:r>
-        <w:rPr>
-          <w:rFonts w:ascii="Calibri" w:hAnsi="Calibri"/>
-          <w:sz w:val="21"/>
-        </w:rPr>
-        <w:t xml:space="preserve">- Database lokal: migration 2026_10_05_000009 berhasil pada MySQL lokal. Tidak melakukan reset/restore database.</w:t>
+        <w:t xml:space="preserve">- Tes otomatis: 187 passed, 1.640 assertions, SQLite in-memory. Mencakup pembayaran manual, expiry, reaktivasi, isolasi tenant, rollback, media/RSVP dan Unpublish.</w:t>
+      </w:r>
+    </w:p>
+    <w:p>
+      <w:pPr>
+        <w:spacing w:after="100"/>
+      </w:pPr>
+      <w:r>
+        <w:rPr>
+          <w:rFonts w:ascii="Calibri" w:hAnsi="Calibri"/>
+          <w:sz w:val="21"/>
+        </w:rPr>
+        <w:t xml:space="preserve">- Database lokal: migration sampai 2026_10_08_000011 berstatus Ran pada pemeriksaan perangkat ini. Tidak melakukan reset/restore database.</w:t>
       </w:r>
     </w:p>
     <w:p>
@@ -449,7 +454,7 @@
           <w:rFonts w:ascii="Calibri" w:hAnsi="Calibri"/>
           <w:sz w:val="21"/>
         </w:rPr>
-        <w:t xml:space="preserve">Bukti awal / lokasi: database/migrations/2026_10_02_000005_link_entitlements_to_product_ids.php; EntitlementProductRelationTest.php; sampai 000007 menurut hasil historis.</w:t>
+        <w:t xml:space="preserve">Bukti awal / lokasi: database/migrations/2026_10_02_000005_link_entitlements_to_product_ids.php; EntitlementProductRelationTest.php; sampai 000011 berstatus Ran pada pemeriksaan 8 Oktober; backup/restore masih perlu diverifikasi.</w:t>
       </w:r>
     </w:p>
     <w:p>
@@ -569,7 +574,7 @@
           <w:rFonts w:ascii="Calibri" w:hAnsi="Calibri"/>
           <w:sz w:val="21"/>
         </w:rPr>
-        <w:t xml:space="preserve">Bukti awal / lokasi: Build historis 796 modul; bukan bukti aset device target terkini.</w:t>
+        <w:t xml:space="preserve">Bukti awal / lokasi: Build lokal terakhir 8 Oktober: 807 modul, termasuk Products/Plans; UAT browser masih perlu dilakukan.</w:t>
       </w:r>
     </w:p>
     <w:p>
@@ -1283,43 +1288,43 @@
           <w:rFonts w:ascii="Calibri" w:hAnsi="Calibri"/>
           <w:sz w:val="21"/>
         </w:rPr>
-        <w:t xml:space="preserve">☐ D04 — Scope Wedding MVP · TUNGGU KEPUTUSAN</w:t>
-      </w:r>
-    </w:p>
-    <w:p>
-      <w:pPr>
-        <w:spacing w:after="100"/>
-      </w:pPr>
-      <w:r>
-        <w:rPr>
-          <w:rFonts w:ascii="Calibri" w:hAnsi="Calibri"/>
-          <w:sz w:val="21"/>
-        </w:rPr>
-        <w:t xml:space="preserve">Status: TUNGGU KEPUTUSAN | PRD: D04 | Bergantung pada: Sesuai fase</w:t>
-      </w:r>
-    </w:p>
-    <w:p>
-      <w:pPr>
-        <w:spacing w:after="100"/>
-      </w:pPr>
-      <w:r>
-        <w:rPr>
-          <w:rFonts w:ascii="Calibri" w:hAnsi="Calibri"/>
-          <w:sz w:val="21"/>
-        </w:rPr>
-        <w:t xml:space="preserve">Penerimaan / tindakan: Tetapkan field konten, template awal, aturan preview/publish/unpublish; putuskan apakah guest/RSVP/wishes wajib rilis pertama.</w:t>
-      </w:r>
-    </w:p>
-    <w:p>
-      <w:pPr>
-        <w:spacing w:after="100"/>
-      </w:pPr>
-      <w:r>
-        <w:rPr>
-          <w:rFonts w:ascii="Calibri" w:hAnsi="Calibri"/>
-          <w:sz w:val="21"/>
-        </w:rPr>
-        <w:t xml:space="preserve">Bukti awal / lokasi: Keputusan tertulis product owner; kolom PIC wajib diisi, jangan menetapkan harga/provider secara otomatis.</w:t>
+        <w:t xml:space="preserve">☐ D04 — Scope Wedding MVP · SEBAGIAN</w:t>
+      </w:r>
+    </w:p>
+    <w:p>
+      <w:pPr>
+        <w:spacing w:after="100"/>
+      </w:pPr>
+      <w:r>
+        <w:rPr>
+          <w:rFonts w:ascii="Calibri" w:hAnsi="Calibri"/>
+          <w:sz w:val="21"/>
+        </w:rPr>
+        <w:t xml:space="preserve">Status: SEBAGIAN | PRD: D04 | Bergantung pada: Sesuai fase</w:t>
+      </w:r>
+    </w:p>
+    <w:p>
+      <w:pPr>
+        <w:spacing w:after="100"/>
+      </w:pPr>
+      <w:r>
+        <w:rPr>
+          <w:rFonts w:ascii="Calibri" w:hAnsi="Calibri"/>
+          <w:sz w:val="21"/>
+        </w:rPr>
+        <w:t xml:space="preserve">Penerimaan / tindakan: Pemilik meminta pengalaman lengkap submit form sampai publish, termasuk template, foto, musik, RSVP dan wishes. Unpublish, retensi dan rincian operasional tersisa mengikuti checklist.</w:t>
+      </w:r>
+    </w:p>
+    <w:p>
+      <w:pPr>
+        <w:spacing w:after="100"/>
+      </w:pPr>
+      <w:r>
+        <w:rPr>
+          <w:rFonts w:ascii="Calibri" w:hAnsi="Calibri"/>
+          <w:sz w:val="21"/>
+        </w:rPr>
+        <w:t xml:space="preserve">Bukti awal / lokasi: Scope disetujui dalam percakapan 8 Oktober; implementasi dan batasnya: WEDDING_STUDIO.md.</w:t>
       </w:r>
     </w:p>
     <w:p>
@@ -1898,43 +1903,43 @@
           <w:rFonts w:ascii="Calibri" w:hAnsi="Calibri"/>
           <w:sz w:val="21"/>
         </w:rPr>
-        <w:t xml:space="preserve">☐ C06 — Media bersama · BELUM</w:t>
-      </w:r>
-    </w:p>
-    <w:p>
-      <w:pPr>
-        <w:spacing w:after="100"/>
-      </w:pPr>
-      <w:r>
-        <w:rPr>
-          <w:rFonts w:ascii="Calibri" w:hAnsi="Calibri"/>
-          <w:sz w:val="21"/>
-        </w:rPr>
-        <w:t xml:space="preserve">Status: BELUM | PRD: CORE 05 | Bergantung pada: D03; D08; aturan quota</w:t>
-      </w:r>
-    </w:p>
-    <w:p>
-      <w:pPr>
-        <w:spacing w:after="100"/>
-      </w:pPr>
-      <w:r>
-        <w:rPr>
-          <w:rFonts w:ascii="Calibri" w:hAnsi="Calibri"/>
-          <w:sz w:val="21"/>
-        </w:rPr>
-        <w:t xml:space="preserve">Penerimaan / tindakan: Validasi MIME/ukuran, kepemilikan tenant, upload storage, signed URL privat dan penghapusan/retensi; uji file invalid, gagal upload dan akses silang.</w:t>
-      </w:r>
-    </w:p>
-    <w:p>
-      <w:pPr>
-        <w:spacing w:after="100"/>
-      </w:pPr>
-      <w:r>
-        <w:rPr>
-          <w:rFonts w:ascii="Calibri" w:hAnsi="Calibri"/>
-          <w:sz w:val="21"/>
-        </w:rPr>
-        <w:t xml:space="preserve">Bukti awal / lokasi: Tambahkan tautan implementasi, migration dan hasil tes saat dikerjakan.</w:t>
+        <w:t xml:space="preserve">☐ C06 — Media bersama · SEBAGIAN</w:t>
+      </w:r>
+    </w:p>
+    <w:p>
+      <w:pPr>
+        <w:spacing w:after="100"/>
+      </w:pPr>
+      <w:r>
+        <w:rPr>
+          <w:rFonts w:ascii="Calibri" w:hAnsi="Calibri"/>
+          <w:sz w:val="21"/>
+        </w:rPr>
+        <w:t xml:space="preserve">Status: SEBAGIAN | PRD: CORE 05 | Bergantung pada: D03; D08; aturan quota</w:t>
+      </w:r>
+    </w:p>
+    <w:p>
+      <w:pPr>
+        <w:spacing w:after="100"/>
+      </w:pPr>
+      <w:r>
+        <w:rPr>
+          <w:rFonts w:ascii="Calibri" w:hAnsi="Calibri"/>
+          <w:sz w:val="21"/>
+        </w:rPr>
+        <w:t xml:space="preserve">Penerimaan / tindakan: Upload privat, validasi MIME/ukuran dan isolasi tenant tersedia. S3/CDN, signed URL, retensi dan penghapusan belum selesai.</w:t>
+      </w:r>
+    </w:p>
+    <w:p>
+      <w:pPr>
+        <w:spacing w:after="100"/>
+      </w:pPr>
+      <w:r>
+        <w:rPr>
+          <w:rFonts w:ascii="Calibri" w:hAnsi="Calibri"/>
+          <w:sz w:val="21"/>
+        </w:rPr>
+        <w:t xml:space="preserve">Bukti awal / lokasi: app/Modules/Core/Media; core_media; config/core_media.php; migration 000011 mempertahankan ID/path/referensi; tes migrasi lulus.</w:t>
       </w:r>
     </w:p>
     <w:p>
@@ -2213,43 +2218,43 @@
           <w:rFonts w:ascii="Calibri" w:hAnsi="Calibri"/>
           <w:sz w:val="21"/>
         </w:rPr>
-        <w:t xml:space="preserve">☐ W01 — Dashboard dan template · SEBAGIAN</w:t>
-      </w:r>
-    </w:p>
-    <w:p>
-      <w:pPr>
-        <w:spacing w:after="100"/>
-      </w:pPr>
-      <w:r>
-        <w:rPr>
-          <w:rFonts w:ascii="Calibri" w:hAnsi="Calibri"/>
-          <w:sz w:val="21"/>
-        </w:rPr>
-        <w:t xml:space="preserve">Status: SEBAGIAN | PRD: WED 01 | Bergantung pada: C10; D04</w:t>
-      </w:r>
-    </w:p>
-    <w:p>
-      <w:pPr>
-        <w:spacing w:after="100"/>
-      </w:pPr>
-      <w:r>
-        <w:rPr>
-          <w:rFonts w:ascii="Calibri" w:hAnsi="Calibri"/>
-          <w:sz w:val="21"/>
-        </w:rPr>
-        <w:t xml:space="preserve">Penerimaan / tindakan: Dashboard Wedding hanya untuk workspace berhak; template aktif menghasilkan draft milik tenant; template nonaktif ditolak.</w:t>
-      </w:r>
-    </w:p>
-    <w:p>
-      <w:pPr>
-        <w:spacing w:after="100"/>
-      </w:pPr>
-      <w:r>
-        <w:rPr>
-          <w:rFonts w:ascii="Calibri" w:hAnsi="Calibri"/>
-          <w:sz w:val="21"/>
-        </w:rPr>
-        <w:t xml:space="preserve">Bukti awal / lokasi: Editor/dashboard Wedding dasar dengan satu tampilan; pemilihan template belum tersedia. Detail: WEDDING_LIFECYCLE.md.</w:t>
+        <w:t xml:space="preserve">☑ W01 — Dashboard dan template · TERSEDIA</w:t>
+      </w:r>
+    </w:p>
+    <w:p>
+      <w:pPr>
+        <w:spacing w:after="100"/>
+      </w:pPr>
+      <w:r>
+        <w:rPr>
+          <w:rFonts w:ascii="Calibri" w:hAnsi="Calibri"/>
+          <w:sz w:val="21"/>
+        </w:rPr>
+        <w:t xml:space="preserve">Status: TERSEDIA | PRD: WED 01 | Bergantung pada: C10; D04</w:t>
+      </w:r>
+    </w:p>
+    <w:p>
+      <w:pPr>
+        <w:spacing w:after="100"/>
+      </w:pPr>
+      <w:r>
+        <w:rPr>
+          <w:rFonts w:ascii="Calibri" w:hAnsi="Calibri"/>
+          <w:sz w:val="21"/>
+        </w:rPr>
+        <w:t xml:space="preserve">Penerimaan / tindakan: Dashboard berhak akses dan pemilihan tiga tema dari allowlist konfigurasi menghasilkan draft tenant; nama template di luar allowlist ditolak.</w:t>
+      </w:r>
+    </w:p>
+    <w:p>
+      <w:pPr>
+        <w:spacing w:after="100"/>
+      </w:pPr>
+      <w:r>
+        <w:rPr>
+          <w:rFonts w:ascii="Calibri" w:hAnsi="Calibri"/>
+          <w:sz w:val="21"/>
+        </w:rPr>
+        <w:t xml:space="preserve">Bukti awal / lokasi: Wedding/Edit.vue, config/wedding_editor.php, SaveInvitationRequest; WeddingEditorExperienceTest. Admin katalog template belum tersedia.</w:t>
       </w:r>
     </w:p>
     <w:p>
@@ -2273,43 +2278,43 @@
           <w:rFonts w:ascii="Calibri" w:hAnsi="Calibri"/>
           <w:sz w:val="21"/>
         </w:rPr>
-        <w:t xml:space="preserve">☐ W02 — Editor konten dan media · SEBAGIAN</w:t>
-      </w:r>
-    </w:p>
-    <w:p>
-      <w:pPr>
-        <w:spacing w:after="100"/>
-      </w:pPr>
-      <w:r>
-        <w:rPr>
-          <w:rFonts w:ascii="Calibri" w:hAnsi="Calibri"/>
-          <w:sz w:val="21"/>
-        </w:rPr>
-        <w:t xml:space="preserve">Status: SEBAGIAN | PRD: WED 02 | Bergantung pada: W01; C06</w:t>
-      </w:r>
-    </w:p>
-    <w:p>
-      <w:pPr>
-        <w:spacing w:after="100"/>
-      </w:pPr>
-      <w:r>
-        <w:rPr>
-          <w:rFonts w:ascii="Calibri" w:hAnsi="Calibri"/>
-          <w:sz w:val="21"/>
-        </w:rPr>
-        <w:t xml:space="preserve">Penerimaan / tindakan: Data pasangan/event/lokasi/tema/media sesuai field final; validasi server dan sanitasi; simpan serta tampilkan kembali tanpa script pengguna.</w:t>
-      </w:r>
-    </w:p>
-    <w:p>
-      <w:pPr>
-        <w:spacing w:after="100"/>
-      </w:pPr>
-      <w:r>
-        <w:rPr>
-          <w:rFonts w:ascii="Calibri" w:hAnsi="Calibri"/>
-          <w:sz w:val="21"/>
-        </w:rPr>
-        <w:t xml:space="preserve">Bukti awal / lokasi: Nama pasangan, tanggal, lokasi dan pesan tersedia; validasi server serta escaping. Upload media dan scope konten lengkap belum. Detail: WEDDING_LIFECYCLE.md.</w:t>
+        <w:t xml:space="preserve">☑ W02 — Editor konten dan media · TERSEDIA</w:t>
+      </w:r>
+    </w:p>
+    <w:p>
+      <w:pPr>
+        <w:spacing w:after="100"/>
+      </w:pPr>
+      <w:r>
+        <w:rPr>
+          <w:rFonts w:ascii="Calibri" w:hAnsi="Calibri"/>
+          <w:sz w:val="21"/>
+        </w:rPr>
+        <w:t xml:space="preserve">Status: TERSEDIA | PRD: WED 02 | Bergantung pada: W01; C06</w:t>
+      </w:r>
+    </w:p>
+    <w:p>
+      <w:pPr>
+        <w:spacing w:after="100"/>
+      </w:pPr>
+      <w:r>
+        <w:rPr>
+          <w:rFonts w:ascii="Calibri" w:hAnsi="Calibri"/>
+          <w:sz w:val="21"/>
+        </w:rPr>
+        <w:t xml:space="preserve">Penerimaan / tindakan: Editor enam langkah mencakup pasangan, acara/lokasi, tema, cover, galeri, musik dan RSVP/wishes; validasi server dan escaping tersedia.</w:t>
+      </w:r>
+    </w:p>
+    <w:p>
+      <w:pPr>
+        <w:spacing w:after="100"/>
+      </w:pPr>
+      <w:r>
+        <w:rPr>
+          <w:rFonts w:ascii="Calibri" w:hAnsi="Calibri"/>
+          <w:sz w:val="21"/>
+        </w:rPr>
+        <w:t xml:space="preserve">Bukti awal / lokasi: WEDDING_STUDIO.md; Core Media; WeddingEditorExperienceTest. Batas upload teknis dicatat terpisah dari kuota komersial.</w:t>
       </w:r>
     </w:p>
     <w:p>
@@ -2429,7 +2434,7 @@
           <w:rFonts w:ascii="Calibri" w:hAnsi="Calibri"/>
           <w:sz w:val="21"/>
         </w:rPr>
-        <w:t xml:space="preserve">Bukti awal / lokasi: Belum ada modul bisnis Wedding pada source yang diperiksa.</w:t>
+        <w:t xml:space="preserve">Bukti awal / lokasi: Wedding Studio, tema, media, RSVP/wishes dan Unpublish tersedia; URL publik masih lokal. Fitur pada item ini belum lengkap; lihat WEDDING_LIFECYCLE.md dan UAT_WEDDING.md.</w:t>
       </w:r>
     </w:p>
     <w:p>
@@ -2489,7 +2494,7 @@
           <w:rFonts w:ascii="Calibri" w:hAnsi="Calibri"/>
           <w:sz w:val="21"/>
         </w:rPr>
-        <w:t xml:space="preserve">Bukti awal / lokasi: Publish ulang mempertahankan periode, expiry menutup publik, pembelian ulang memakai undangan lama. Unpublish, DNS, quota dan concurrency belum diuji. Detail: WEDDING_LIFECYCLE.md.</w:t>
+        <w:t xml:space="preserve">Bukti awal / lokasi: Publish ulang mempertahankan periode, expiry menutup publik, pembelian ulang memakai undangan lama. Unpublish menutup halaman/media/respons publik; preview/data dan periode tetap. WeddingEditorExperienceTest menguji publish kembali dan akses owner. DNS, quota dan concurrency belum diuji.</w:t>
       </w:r>
     </w:p>
     <w:p>
@@ -2513,43 +2518,43 @@
           <w:rFonts w:ascii="Calibri" w:hAnsi="Calibri"/>
           <w:sz w:val="21"/>
         </w:rPr>
-        <w:t xml:space="preserve">☐ W06 — Guest, RSVP dan wishes · OPSIONAL</w:t>
-      </w:r>
-    </w:p>
-    <w:p>
-      <w:pPr>
-        <w:spacing w:after="100"/>
-      </w:pPr>
-      <w:r>
-        <w:rPr>
-          <w:rFonts w:ascii="Calibri" w:hAnsi="Calibri"/>
-          <w:sz w:val="21"/>
-        </w:rPr>
-        <w:t xml:space="preserve">Status: OPSIONAL | PRD: WED 04 | Bergantung pada: D04; W04</w:t>
-      </w:r>
-    </w:p>
-    <w:p>
-      <w:pPr>
-        <w:spacing w:after="100"/>
-      </w:pPr>
-      <w:r>
-        <w:rPr>
-          <w:rFonts w:ascii="Calibri" w:hAnsi="Calibri"/>
-          <w:sz w:val="21"/>
-        </w:rPr>
-        <w:t xml:space="preserve">Penerimaan / tindakan: Hanya jika masuk scope: respons tervalidasi/rate-limited, daftar tamu tetap privat, owner melihat respons undangannya.</w:t>
-      </w:r>
-    </w:p>
-    <w:p>
-      <w:pPr>
-        <w:spacing w:after="100"/>
-      </w:pPr>
-      <w:r>
-        <w:rPr>
-          <w:rFonts w:ascii="Calibri" w:hAnsi="Calibri"/>
-          <w:sz w:val="21"/>
-        </w:rPr>
-        <w:t xml:space="preserve">Bukti awal / lokasi: Belum ada modul bisnis Wedding pada source yang diperiksa.</w:t>
+        <w:t xml:space="preserve">☐ W06 — Guest, RSVP dan wishes · SEBAGIAN</w:t>
+      </w:r>
+    </w:p>
+    <w:p>
+      <w:pPr>
+        <w:spacing w:after="100"/>
+      </w:pPr>
+      <w:r>
+        <w:rPr>
+          <w:rFonts w:ascii="Calibri" w:hAnsi="Calibri"/>
+          <w:sz w:val="21"/>
+        </w:rPr>
+        <w:t xml:space="preserve">Status: SEBAGIAN | PRD: WED 04 | Bergantung pada: D04; W04</w:t>
+      </w:r>
+    </w:p>
+    <w:p>
+      <w:pPr>
+        <w:spacing w:after="100"/>
+      </w:pPr>
+      <w:r>
+        <w:rPr>
+          <w:rFonts w:ascii="Calibri" w:hAnsi="Calibri"/>
+          <w:sz w:val="21"/>
+        </w:rPr>
+        <w:t xml:space="preserve">Penerimaan / tindakan: RSVP/wishes masuk scope dan tersedia dengan validasi, throttle, idempotensi, ringkasan privat serta moderasi wishes. Daftar tamu personal belum tersedia.</w:t>
+      </w:r>
+    </w:p>
+    <w:p>
+      <w:pPr>
+        <w:spacing w:after="100"/>
+      </w:pPr>
+      <w:r>
+        <w:rPr>
+          <w:rFonts w:ascii="Calibri" w:hAnsi="Calibri"/>
+          <w:sz w:val="21"/>
+        </w:rPr>
+        <w:t xml:space="preserve">Bukti awal / lokasi: ResponseController; wedding_responses; Wedding/Edit.vue; wedding/invitation.blade.php; tes akses silang dan moderasi lulus.</w:t>
       </w:r>
     </w:p>
     <w:p>
@@ -2609,7 +2614,7 @@
           <w:rFonts w:ascii="Calibri" w:hAnsi="Calibri"/>
           <w:sz w:val="21"/>
         </w:rPr>
-        <w:t xml:space="preserve">Bukti awal / lokasi: Belum ada modul bisnis Wedding pada source yang diperiksa.</w:t>
+        <w:t xml:space="preserve">Bukti awal / lokasi: Wedding Studio, tema, media, RSVP/wishes dan Unpublish tersedia; URL publik masih lokal. Fitur pada item ini belum lengkap; lihat WEDDING_LIFECYCLE.md dan UAT_WEDDING.md.</w:t>
       </w:r>
     </w:p>
     <w:p>
@@ -2669,7 +2674,7 @@
           <w:rFonts w:ascii="Calibri" w:hAnsi="Calibri"/>
           <w:sz w:val="21"/>
         </w:rPr>
-        <w:t xml:space="preserve">Bukti awal / lokasi: Belum ada modul bisnis Wedding pada source yang diperiksa.</w:t>
+        <w:t xml:space="preserve">Bukti awal / lokasi: Wedding Studio, tema, media, RSVP/wishes dan Unpublish tersedia; URL publik masih lokal. Fitur pada item ini belum lengkap; lihat WEDDING_LIFECYCLE.md dan UAT_WEDDING.md.</w:t>
       </w:r>
     </w:p>
     <w:p>

</xml_diff>